<commit_message>
feat(templates): inject [SIG:PARTY] placeholders into UAF blank-set DOCX templates (Prompt 21)
- Add scripts/add_signature_placeholders.py — one-shot python-docx script that
  locates the correct table/row/col in each FR.2xx form and appends an 8pt
  light-gray [SIG:KEY] marker to the signing cell
- Modify all FR.218/220/221/222/223/224/229/230/231/232/211 templates under
  backend/uaf_blank_set/ (all standard variants: 9001 bundle, 27001, 13485)
- Placeholders: CB_PLANNER · CB_REVIEWER · CB_CERT_MANAGER · LEAD_AUDITOR ·
  CLIENT · AUDITOR_MEMBER
- FR.225 (meeting/guest) and FR.234 (notification) intentionally skipped
- These markers are detected by pdfplumber in Prompt 23 to produce signature
  field coordinates; they are whited-out or replaced during PDF flattening in Prompt 26
</commit_message>
<xml_diff>
--- a/backend/uaf_blank_set/13485/Initial Certification /Stage 1/FR.211LeadAuditorAuditorAssessmentFormR1&10.06.2024 - Kopya.docx
+++ b/backend/uaf_blank_set/13485/Initial Certification /Stage 1/FR.211LeadAuditorAuditorAssessmentFormR1&10.06.2024 - Kopya.docx
@@ -2127,6 +2127,14 @@
                 <w:sz w:val="18"/>
               </w:rPr>
             </w:pPr>
+            <w:r>
+              <w:rPr>
+                <w:i/>
+                <w:color w:val="B4B4B4"/>
+                <w:sz w:val="16"/>
+              </w:rPr>
+              <w:t>[SIG:CLIENT]</w:t>
+            </w:r>
           </w:p>
         </w:tc>
       </w:tr>

</xml_diff>